<commit_message>
docs: update LinkedIn article in Word document with current CIE context
</commit_message>
<xml_diff>
--- a/Why I Built a Multi-Agent Career Optimization Engine.docx
+++ b/Why I Built a Multi-Agent Career Optimization Engine.docx
@@ -276,7 +276,7 @@
           <w:color w:val="1f1f1f"/>
           <w:rtl w:val="0"/>
         </w:rPr>
-        <w:t xml:space="preserve"> The state-of-the-art in AI agents changes every single week. A paradigm that is dominant today (e.g., custom, brittle orchestrators) can be replaced by specialized patterns like hierarchical swarms or SQLite round-trip sync containers by next Monday.</w:t>
+        <w:t xml:space="preserve"> The state-of-the-art in AI agents changes every single week. A paradigm that is dominant today (e.g., custom, brittle orchestrators) can be replaced by specialized patterns like Git-as-a-Database memory synchronization or TDD Pytest workspaces by next Monday.</w:t>
       </w:r>
     </w:p>
     <w:p>
@@ -375,30 +375,7 @@
         </w:rPr>
       </w:pPr>
       <w:r>
-        <w:rPr>
-          <w:rFonts w:ascii="Google Sans" w:cs="Google Sans" w:eastAsia="Google Sans" w:hAnsi="Google Sans"/>
-          <w:color w:val="1f1f1f"/>
-          <w:rtl w:val="0"/>
-        </w:rPr>
-        <w:t xml:space="preserve">It is an autonomous, multi-agent, serverless ecosystem that scans regional job boards, scrapes stealth corporate ATS pipelines, normalizes strategic hiring trends, updates master resumes </w:t>
-      </w:r>
-      <w:r>
-        <w:rPr>
-          <w:rFonts w:ascii="Google Sans" w:cs="Google Sans" w:eastAsia="Google Sans" w:hAnsi="Google Sans"/>
-          <w:i w:val="1"/>
-          <w:iCs w:val="1"/>
-          <w:color w:val="1f1f1f"/>
-          <w:rtl w:val="0"/>
-        </w:rPr>
-        <w:t xml:space="preserve">in-place</w:t>
-      </w:r>
-      <w:r>
-        <w:rPr>
-          <w:rFonts w:ascii="Google Sans" w:cs="Google Sans" w:eastAsia="Google Sans" w:hAnsi="Google Sans"/>
-          <w:color w:val="1f1f1f"/>
-          <w:rtl w:val="0"/>
-        </w:rPr>
-        <w:t xml:space="preserve">, constructs target upskilling workspaces, conducts adaptive mock interview dry-runs, and programmatically scaffolds open-source proof-of-work repositories.</w:t>
+        <w:t>It is an autonomous, multi-agent, serverless ecosystem that scans regional job boards, scrapes stealth corporate ATS pipelines, normalizes strategic hiring trends, updates master resumes in-place via reverse GitHub profile loop ingestion, compiles pre-anchored upskilling briefs, conducts adaptive mock interview dry-runs, and programmatically scaffolds Pytest-driven TDD proof-of-work repositories.</w:t>
       </w:r>
     </w:p>
     <w:p>
@@ -836,38 +813,38 @@
           <w:shd w:fill="141414" w:val="clear"/>
           <w:rtl w:val="0"/>
         </w:rPr>
-        <w:t xml:space="preserve">┌──────────────────────────────────────────────────────────┐</w:t>
-        <w:br w:type="textWrapping"/>
-        <w:t xml:space="preserve">│                Weekly GitHub Actions Cron                │</w:t>
-        <w:br w:type="textWrapping"/>
-        <w:t xml:space="preserve">└────────────────────────────┬─────────────────────────────┘</w:t>
-        <w:br w:type="textWrapping"/>
+        <w:t>┌──────────────────────────────────────────────────────────┐</w:t>
+        <w:br/>
+        <w:t>│                Weekly GitHub Actions Cron                │</w:t>
+        <w:br/>
+        <w:t>└────────────────────────────┬─────────────────────────────┘</w:t>
+        <w:br/>
         <w:t xml:space="preserve">                             ▼</w:t>
-        <w:br w:type="textWrapping"/>
+        <w:br/>
         <w:t xml:space="preserve">              ┌──────────────────────────────┐</w:t>
-        <w:br w:type="textWrapping"/>
+        <w:br/>
         <w:t xml:space="preserve">              │ Config-Driven Python Engine  │</w:t>
-        <w:br w:type="textWrapping"/>
+        <w:br/>
         <w:t xml:space="preserve">              │ (Swappable Claude / Gemini)  │</w:t>
-        <w:br w:type="textWrapping"/>
+        <w:br/>
         <w:t xml:space="preserve">              └──────────────┬───────────────┘</w:t>
-        <w:br w:type="textWrapping"/>
+        <w:br/>
         <w:t xml:space="preserve">                             ▼</w:t>
-        <w:br w:type="textWrapping"/>
+        <w:br/>
         <w:t xml:space="preserve">              ┌──────────────────────────────┐</w:t>
-        <w:br w:type="textWrapping"/>
+        <w:br/>
         <w:t xml:space="preserve">              │ SQLite Database (themes.db)  │</w:t>
-        <w:br w:type="textWrapping"/>
+        <w:br/>
         <w:t xml:space="preserve">              └──────────────┬───────────────┘</w:t>
-        <w:br w:type="textWrapping"/>
+        <w:br/>
         <w:t xml:space="preserve">                             ▼</w:t>
-        <w:br w:type="textWrapping"/>
+        <w:br/>
         <w:t xml:space="preserve">        ┌──────────────────────────────────────────┐</w:t>
-        <w:br w:type="textWrapping"/>
-        <w:t xml:space="preserve">        │ Dropbox Round-Trip Cloud Storage Sync    │</w:t>
-        <w:br w:type="textWrapping"/>
+        <w:br/>
+        <w:t xml:space="preserve">        │ Git-as-a-Database state-store Sync          │</w:t>
+        <w:br/>
         <w:t xml:space="preserve">        └──────────────────────────────────────────┘</w:t>
-        <w:br w:type="textWrapping"/>
+        <w:br/>
       </w:r>
     </w:p>
     <w:p>
@@ -910,7 +887,7 @@
           <w:color w:val="1f1f1f"/>
           <w:rtl w:val="0"/>
         </w:rPr>
-        <w:t xml:space="preserve">, outsourced our anti-bot defense to rotating proxy nodes, gave us swappable model flexibility (Claude/Gemini) through a single configuration key, and maintained a continuous historical state using a Dropbox-linked SQLite database.</w:t>
+        <w:t>, outsourced our anti-bot defense to rotating proxy nodes, gave us swappable model flexibility (Claude/Gemini) through a single configuration key, and maintained a continuous historical state using a Git-as-a-Database state branch sync.</w:t>
       </w:r>
     </w:p>
     <w:p>
@@ -2428,12 +2405,155 @@
         </w:rPr>
       </w:pPr>
       <w:r>
-        <w:rPr>
-          <w:rFonts w:ascii="Google Sans" w:cs="Google Sans" w:eastAsia="Google Sans" w:hAnsi="Google Sans"/>
-          <w:color w:val="1f1f1f"/>
-          <w:rtl w:val="0"/>
-        </w:rPr>
-        <w:t xml:space="preserve">The system utilizes five specialized, autonomous agents coordinating execution state via a central SQLite persistence layer (</w:t>
+        <w:t>The system utilizes five specialized, autonomous agents coordinating execution state via a central SQLite persistence layer (themes.db) synced dynamically via a Git-as-a-Database state-store branch.</w:t>
+      </w:r>
+    </w:p>
+    <w:p>
+      <w:pPr>
+        <w:pStyle w:val="Heading3"/>
+        <w:pBdr>
+          <w:top w:space="0" w:sz="0" w:val="nil"/>
+          <w:left w:space="0" w:sz="0" w:val="nil"/>
+          <w:bottom w:space="0" w:sz="0" w:val="nil"/>
+          <w:right w:space="0" w:sz="0" w:val="nil"/>
+          <w:between w:space="0" w:sz="0" w:val="nil"/>
+        </w:pBdr>
+        <w:shd w:fill="auto" w:val="clear"/>
+        <w:spacing w:before="0" w:line="275.9999942779541" w:lineRule="auto"/>
+        <w:rPr>
+          <w:rFonts w:ascii="Google Sans" w:cs="Google Sans" w:eastAsia="Google Sans" w:hAnsi="Google Sans"/>
+          <w:color w:val="1f1f1f"/>
+        </w:rPr>
+      </w:pPr>
+      <w:r>
+        <w:rPr>
+          <w:rFonts w:ascii="Google Sans" w:cs="Google Sans" w:eastAsia="Google Sans" w:hAnsi="Google Sans"/>
+          <w:color w:val="1f1f1f"/>
+          <w:rtl w:val="0"/>
+        </w:rPr>
+        <w:t xml:space="preserve">1. Job Scanner &amp; Resume Tuner</w:t>
+      </w:r>
+    </w:p>
+    <w:p>
+      <w:pPr>
+        <w:pBdr>
+          <w:top w:space="0" w:sz="0" w:val="nil"/>
+          <w:left w:space="0" w:sz="0" w:val="nil"/>
+          <w:bottom w:space="0" w:sz="0" w:val="nil"/>
+          <w:right w:space="0" w:sz="0" w:val="nil"/>
+          <w:between w:space="0" w:sz="0" w:val="nil"/>
+        </w:pBdr>
+        <w:shd w:fill="auto" w:val="clear"/>
+        <w:spacing w:line="275.9999942779541" w:lineRule="auto"/>
+        <w:rPr>
+          <w:rFonts w:ascii="Google Sans" w:cs="Google Sans" w:eastAsia="Google Sans" w:hAnsi="Google Sans"/>
+          <w:color w:val="1f1f1f"/>
+        </w:rPr>
+      </w:pPr>
+      <w:r>
+        <w:t>Instead of using reckless generative rewrites that destroy document structures, this agent extracts frequency-weighted themes from raw job listings and executes in-place XML document tree paragraph injection. It edits experience bullets directly within the master .docx resume incorporating a reverse loop that extracts strengths from the candidate's active public GitHub profile while flawlessly preserving typography and layout.</w:t>
+      </w:r>
+    </w:p>
+    <w:p>
+      <w:pPr>
+        <w:pStyle w:val="Heading3"/>
+        <w:pBdr>
+          <w:top w:space="0" w:sz="0" w:val="nil"/>
+          <w:left w:space="0" w:sz="0" w:val="nil"/>
+          <w:bottom w:space="0" w:sz="0" w:val="nil"/>
+          <w:right w:space="0" w:sz="0" w:val="nil"/>
+          <w:between w:space="0" w:sz="0" w:val="nil"/>
+        </w:pBdr>
+        <w:shd w:fill="auto" w:val="clear"/>
+        <w:spacing w:before="0" w:line="275.9999942779541" w:lineRule="auto"/>
+        <w:rPr>
+          <w:rFonts w:ascii="Google Sans" w:cs="Google Sans" w:eastAsia="Google Sans" w:hAnsi="Google Sans"/>
+          <w:color w:val="1f1f1f"/>
+        </w:rPr>
+      </w:pPr>
+      <w:r>
+        <w:rPr>
+          <w:rFonts w:ascii="Google Sans" w:cs="Google Sans" w:eastAsia="Google Sans" w:hAnsi="Google Sans"/>
+          <w:color w:val="1f1f1f"/>
+          <w:rtl w:val="0"/>
+        </w:rPr>
+        <w:t xml:space="preserve">2. Opportunity Watchdog</w:t>
+      </w:r>
+    </w:p>
+    <w:p>
+      <w:pPr>
+        <w:pBdr>
+          <w:top w:space="0" w:sz="0" w:val="nil"/>
+          <w:left w:space="0" w:sz="0" w:val="nil"/>
+          <w:bottom w:space="0" w:sz="0" w:val="nil"/>
+          <w:right w:space="0" w:sz="0" w:val="nil"/>
+          <w:between w:space="0" w:sz="0" w:val="nil"/>
+        </w:pBdr>
+        <w:shd w:fill="auto" w:val="clear"/>
+        <w:spacing w:line="275.9999942779541" w:lineRule="auto"/>
+        <w:rPr>
+          <w:rFonts w:ascii="Google Sans" w:cs="Google Sans" w:eastAsia="Google Sans" w:hAnsi="Google Sans"/>
+          <w:color w:val="1f1f1f"/>
+        </w:rPr>
+      </w:pPr>
+      <w:r>
+        <w:rPr>
+          <w:rFonts w:ascii="Google Sans" w:cs="Google Sans" w:eastAsia="Google Sans" w:hAnsi="Google Sans"/>
+          <w:color w:val="1f1f1f"/>
+          <w:rtl w:val="0"/>
+        </w:rPr>
+        <w:t xml:space="preserve">Because public job boards are trailing indicators, this watchdog completely bypasses aggregators. It directly parses the public Greenhouse and Lever ATS endpoints of selected, high-growth AI companies, instantly indexing and flagging stealth positions the second they go live.</w:t>
+      </w:r>
+    </w:p>
+    <w:p>
+      <w:pPr>
+        <w:pStyle w:val="Heading3"/>
+        <w:pBdr>
+          <w:top w:space="0" w:sz="0" w:val="nil"/>
+          <w:left w:space="0" w:sz="0" w:val="nil"/>
+          <w:bottom w:space="0" w:sz="0" w:val="nil"/>
+          <w:right w:space="0" w:sz="0" w:val="nil"/>
+          <w:between w:space="0" w:sz="0" w:val="nil"/>
+        </w:pBdr>
+        <w:shd w:fill="auto" w:val="clear"/>
+        <w:spacing w:before="0" w:line="275.9999942779541" w:lineRule="auto"/>
+        <w:rPr>
+          <w:rFonts w:ascii="Google Sans" w:cs="Google Sans" w:eastAsia="Google Sans" w:hAnsi="Google Sans"/>
+          <w:color w:val="1f1f1f"/>
+        </w:rPr>
+      </w:pPr>
+      <w:r>
+        <w:rPr>
+          <w:rFonts w:ascii="Google Sans" w:cs="Google Sans" w:eastAsia="Google Sans" w:hAnsi="Google Sans"/>
+          <w:color w:val="1f1f1f"/>
+          <w:rtl w:val="0"/>
+        </w:rPr>
+        <w:t xml:space="preserve">3. Agent Tutor (Closed-Loop Upskilling)</w:t>
+      </w:r>
+    </w:p>
+    <w:p>
+      <w:pPr>
+        <w:pBdr>
+          <w:top w:space="0" w:sz="0" w:val="nil"/>
+          <w:left w:space="0" w:sz="0" w:val="nil"/>
+          <w:bottom w:space="0" w:sz="0" w:val="nil"/>
+          <w:right w:space="0" w:sz="0" w:val="nil"/>
+          <w:between w:space="0" w:sz="0" w:val="nil"/>
+        </w:pBdr>
+        <w:shd w:fill="auto" w:val="clear"/>
+        <w:spacing w:line="275.9999942779541" w:lineRule="auto"/>
+        <w:rPr>
+          <w:rFonts w:ascii="Google Sans" w:cs="Google Sans" w:eastAsia="Google Sans" w:hAnsi="Google Sans"/>
+          <w:color w:val="1f1f1f"/>
+        </w:rPr>
+      </w:pPr>
+      <w:r>
+        <w:rPr>
+          <w:rFonts w:ascii="Google Sans" w:cs="Google Sans" w:eastAsia="Google Sans" w:hAnsi="Google Sans"/>
+          <w:color w:val="1f1f1f"/>
+          <w:rtl w:val="0"/>
+        </w:rPr>
+        <w:t xml:space="preserve">The engine closes technical skill gaps by deploying an automated personal learning hub. When an unmapped trend keyword is flagged in </w:t>
       </w:r>
       <w:r>
         <w:rPr>
@@ -2453,7 +2573,27 @@
           <w:color w:val="1f1f1f"/>
           <w:rtl w:val="0"/>
         </w:rPr>
-        <w:t xml:space="preserve">) synced round-trip to the cloud.</w:t>
+        <w:t>, the Agent Tutor queries academic whitepapers (arXiv API) and developer documentation repositories (GitHub APIs) to compile hyper-dense, pre-anchored markdown ingestion briefs designed for optimal Google NotebookLM context recall.</w:t>
+      </w:r>
+    </w:p>
+    <w:p>
+      <w:pPr>
+        <w:pBdr>
+          <w:top w:space="0" w:sz="0" w:val="nil"/>
+          <w:left w:space="0" w:sz="0" w:val="nil"/>
+          <w:bottom w:space="0" w:sz="0" w:val="nil"/>
+          <w:right w:space="0" w:sz="0" w:val="nil"/>
+          <w:between w:space="0" w:sz="0" w:val="nil"/>
+        </w:pBdr>
+        <w:shd w:fill="auto" w:val="clear"/>
+        <w:spacing w:line="275.9999942779541" w:lineRule="auto"/>
+        <w:rPr>
+          <w:rFonts w:ascii="Google Sans" w:cs="Google Sans" w:eastAsia="Google Sans" w:hAnsi="Google Sans"/>
+          <w:color w:val="1f1f1f"/>
+        </w:rPr>
+      </w:pPr>
+      <w:r>
+        <w:t>It compiles these references into notebook_ingest_source.md featuring pre-formatted retrieval anchors, synthesizes multimodal conversational overview podcasts, visual mindmaps, and emails a structured Weekly Study Plan directly to me.</w:t>
       </w:r>
     </w:p>
     <w:p>
@@ -2479,7 +2619,7 @@
           <w:color w:val="1f1f1f"/>
           <w:rtl w:val="0"/>
         </w:rPr>
-        <w:t xml:space="preserve">1. Job Scanner &amp; Resume Tuner</w:t>
+        <w:t xml:space="preserve">4. Intelligent Deduplication &amp; Active Interview Coaching</w:t>
       </w:r>
     </w:p>
     <w:p>
@@ -2504,45 +2644,7 @@
           <w:color w:val="1f1f1f"/>
           <w:rtl w:val="0"/>
         </w:rPr>
-        <w:t xml:space="preserve">Instead of using reckless generative rewrites that destroy document structures, this agent extracts frequency-weighted themes from raw job listings and executes </w:t>
-      </w:r>
-      <w:r>
-        <w:rPr>
-          <w:rFonts w:ascii="Google Sans" w:cs="Google Sans" w:eastAsia="Google Sans" w:hAnsi="Google Sans"/>
-          <w:b w:val="1"/>
-          <w:bCs w:val="1"/>
-          <w:color w:val="1f1f1f"/>
-          <w:rtl w:val="0"/>
-        </w:rPr>
-        <w:t xml:space="preserve">in-place XML document tree paragraph injection</w:t>
-      </w:r>
-      <w:r>
-        <w:rPr>
-          <w:rFonts w:ascii="Google Sans" w:cs="Google Sans" w:eastAsia="Google Sans" w:hAnsi="Google Sans"/>
-          <w:color w:val="1f1f1f"/>
-          <w:rtl w:val="0"/>
-        </w:rPr>
-        <w:t xml:space="preserve">. It edits experience bullets directly within the master </w:t>
-      </w:r>
-      <w:r>
-        <w:rPr>
-          <w:rFonts w:ascii="Google Sans" w:cs="Google Sans" w:eastAsia="Google Sans" w:hAnsi="Google Sans"/>
-          <w:i w:val="0"/>
-          <w:iCs w:val="0"/>
-          <w:color w:val="000000"/>
-          <w:sz w:val="22"/>
-          <w:szCs w:val="22"/>
-          <w:rtl w:val="0"/>
-        </w:rPr>
-        <w:t xml:space="preserve">.docx</w:t>
-      </w:r>
-      <w:r>
-        <w:rPr>
-          <w:rFonts w:ascii="Google Sans" w:cs="Google Sans" w:eastAsia="Google Sans" w:hAnsi="Google Sans"/>
-          <w:color w:val="1f1f1f"/>
-          <w:rtl w:val="0"/>
-        </w:rPr>
-        <w:t xml:space="preserve"> resume to match weekly market shifts while flawlessly preserving typography and layout.</w:t>
+        <w:t xml:space="preserve">To protect API token limits and compute resources, agents utilize semantic key normalization. They query historical SQLite registers before running expensive third-party integrations. If an interview module is required, the Mock Interviewer cross-references my tailored resume with trending technical stacks to generate custom architectural, coding, and system-design questions, outputting granular Markdown feedback scorecards.</w:t>
       </w:r>
     </w:p>
     <w:p>
@@ -2568,7 +2670,7 @@
           <w:color w:val="1f1f1f"/>
           <w:rtl w:val="0"/>
         </w:rPr>
-        <w:t xml:space="preserve">2. Opportunity Watchdog</w:t>
+        <w:t xml:space="preserve">5. Portfolio Architect (Programmatic Proof-of-Work)</w:t>
       </w:r>
     </w:p>
     <w:p>
@@ -2588,266 +2690,7 @@
         </w:rPr>
       </w:pPr>
       <w:r>
-        <w:rPr>
-          <w:rFonts w:ascii="Google Sans" w:cs="Google Sans" w:eastAsia="Google Sans" w:hAnsi="Google Sans"/>
-          <w:color w:val="1f1f1f"/>
-          <w:rtl w:val="0"/>
-        </w:rPr>
-        <w:t xml:space="preserve">Because public job boards are trailing indicators, this watchdog completely bypasses aggregators. It directly parses the public Greenhouse and Lever ATS endpoints of selected, high-growth AI companies, instantly indexing and flagging stealth positions the second they go live.</w:t>
-      </w:r>
-    </w:p>
-    <w:p>
-      <w:pPr>
-        <w:pStyle w:val="Heading3"/>
-        <w:pBdr>
-          <w:top w:space="0" w:sz="0" w:val="nil"/>
-          <w:left w:space="0" w:sz="0" w:val="nil"/>
-          <w:bottom w:space="0" w:sz="0" w:val="nil"/>
-          <w:right w:space="0" w:sz="0" w:val="nil"/>
-          <w:between w:space="0" w:sz="0" w:val="nil"/>
-        </w:pBdr>
-        <w:shd w:fill="auto" w:val="clear"/>
-        <w:spacing w:before="0" w:line="275.9999942779541" w:lineRule="auto"/>
-        <w:rPr>
-          <w:rFonts w:ascii="Google Sans" w:cs="Google Sans" w:eastAsia="Google Sans" w:hAnsi="Google Sans"/>
-          <w:color w:val="1f1f1f"/>
-        </w:rPr>
-      </w:pPr>
-      <w:r>
-        <w:rPr>
-          <w:rFonts w:ascii="Google Sans" w:cs="Google Sans" w:eastAsia="Google Sans" w:hAnsi="Google Sans"/>
-          <w:color w:val="1f1f1f"/>
-          <w:rtl w:val="0"/>
-        </w:rPr>
-        <w:t xml:space="preserve">3. Agent Tutor (Closed-Loop Upskilling)</w:t>
-      </w:r>
-    </w:p>
-    <w:p>
-      <w:pPr>
-        <w:pBdr>
-          <w:top w:space="0" w:sz="0" w:val="nil"/>
-          <w:left w:space="0" w:sz="0" w:val="nil"/>
-          <w:bottom w:space="0" w:sz="0" w:val="nil"/>
-          <w:right w:space="0" w:sz="0" w:val="nil"/>
-          <w:between w:space="0" w:sz="0" w:val="nil"/>
-        </w:pBdr>
-        <w:shd w:fill="auto" w:val="clear"/>
-        <w:spacing w:line="275.9999942779541" w:lineRule="auto"/>
-        <w:rPr>
-          <w:rFonts w:ascii="Google Sans" w:cs="Google Sans" w:eastAsia="Google Sans" w:hAnsi="Google Sans"/>
-          <w:color w:val="1f1f1f"/>
-        </w:rPr>
-      </w:pPr>
-      <w:r>
-        <w:rPr>
-          <w:rFonts w:ascii="Google Sans" w:cs="Google Sans" w:eastAsia="Google Sans" w:hAnsi="Google Sans"/>
-          <w:color w:val="1f1f1f"/>
-          <w:rtl w:val="0"/>
-        </w:rPr>
-        <w:t xml:space="preserve">The engine closes technical skill gaps by deploying an automated personal learning hub. When an unmapped trend keyword is flagged in </w:t>
-      </w:r>
-      <w:r>
-        <w:rPr>
-          <w:rFonts w:ascii="Google Sans" w:cs="Google Sans" w:eastAsia="Google Sans" w:hAnsi="Google Sans"/>
-          <w:i w:val="0"/>
-          <w:iCs w:val="0"/>
-          <w:color w:val="000000"/>
-          <w:sz w:val="22"/>
-          <w:szCs w:val="22"/>
-          <w:rtl w:val="0"/>
-        </w:rPr>
-        <w:t xml:space="preserve">themes.db</w:t>
-      </w:r>
-      <w:r>
-        <w:rPr>
-          <w:rFonts w:ascii="Google Sans" w:cs="Google Sans" w:eastAsia="Google Sans" w:hAnsi="Google Sans"/>
-          <w:color w:val="1f1f1f"/>
-          <w:rtl w:val="0"/>
-        </w:rPr>
-        <w:t xml:space="preserve">, the Agent Tutor queries academic whitepapers (arXiv API) and developer documentation repositories (GitHub APIs) to compile factual, source-grounded references.</w:t>
-      </w:r>
-    </w:p>
-    <w:p>
-      <w:pPr>
-        <w:pBdr>
-          <w:top w:space="0" w:sz="0" w:val="nil"/>
-          <w:left w:space="0" w:sz="0" w:val="nil"/>
-          <w:bottom w:space="0" w:sz="0" w:val="nil"/>
-          <w:right w:space="0" w:sz="0" w:val="nil"/>
-          <w:between w:space="0" w:sz="0" w:val="nil"/>
-        </w:pBdr>
-        <w:shd w:fill="auto" w:val="clear"/>
-        <w:spacing w:line="275.9999942779541" w:lineRule="auto"/>
-        <w:rPr>
-          <w:rFonts w:ascii="Google Sans" w:cs="Google Sans" w:eastAsia="Google Sans" w:hAnsi="Google Sans"/>
-          <w:color w:val="1f1f1f"/>
-        </w:rPr>
-      </w:pPr>
-      <w:r>
-        <w:rPr>
-          <w:rFonts w:ascii="Google Sans" w:cs="Google Sans" w:eastAsia="Google Sans" w:hAnsi="Google Sans"/>
-          <w:color w:val="1f1f1f"/>
-          <w:rtl w:val="0"/>
-        </w:rPr>
-        <w:t xml:space="preserve">It programmatically instantiates a Google NotebookLM workspace (with Google Gemini Context Caching as a fallback) named </w:t>
-      </w:r>
-      <w:r>
-        <w:rPr>
-          <w:rFonts w:ascii="Google Sans" w:cs="Google Sans" w:eastAsia="Google Sans" w:hAnsi="Google Sans"/>
-          <w:i w:val="0"/>
-          <w:iCs w:val="0"/>
-          <w:color w:val="000000"/>
-          <w:sz w:val="22"/>
-          <w:szCs w:val="22"/>
-          <w:rtl w:val="0"/>
-        </w:rPr>
-        <w:t xml:space="preserve">&lt;&lt;TopicName-DateOfCreation&gt;&gt;</w:t>
-      </w:r>
-      <w:r>
-        <w:rPr>
-          <w:rFonts w:ascii="Google Sans" w:cs="Google Sans" w:eastAsia="Google Sans" w:hAnsi="Google Sans"/>
-          <w:color w:val="1f1f1f"/>
-          <w:rtl w:val="0"/>
-        </w:rPr>
-        <w:t xml:space="preserve">, generates conversational audio podcasts, visual mindmaps, and emails a structured Weekly Study Plan directly to me.</w:t>
-      </w:r>
-    </w:p>
-    <w:p>
-      <w:pPr>
-        <w:pStyle w:val="Heading3"/>
-        <w:pBdr>
-          <w:top w:space="0" w:sz="0" w:val="nil"/>
-          <w:left w:space="0" w:sz="0" w:val="nil"/>
-          <w:bottom w:space="0" w:sz="0" w:val="nil"/>
-          <w:right w:space="0" w:sz="0" w:val="nil"/>
-          <w:between w:space="0" w:sz="0" w:val="nil"/>
-        </w:pBdr>
-        <w:shd w:fill="auto" w:val="clear"/>
-        <w:spacing w:before="0" w:line="275.9999942779541" w:lineRule="auto"/>
-        <w:rPr>
-          <w:rFonts w:ascii="Google Sans" w:cs="Google Sans" w:eastAsia="Google Sans" w:hAnsi="Google Sans"/>
-          <w:color w:val="1f1f1f"/>
-        </w:rPr>
-      </w:pPr>
-      <w:r>
-        <w:rPr>
-          <w:rFonts w:ascii="Google Sans" w:cs="Google Sans" w:eastAsia="Google Sans" w:hAnsi="Google Sans"/>
-          <w:color w:val="1f1f1f"/>
-          <w:rtl w:val="0"/>
-        </w:rPr>
-        <w:t xml:space="preserve">4. Intelligent Deduplication &amp; Active Interview Coaching</w:t>
-      </w:r>
-    </w:p>
-    <w:p>
-      <w:pPr>
-        <w:pBdr>
-          <w:top w:space="0" w:sz="0" w:val="nil"/>
-          <w:left w:space="0" w:sz="0" w:val="nil"/>
-          <w:bottom w:space="0" w:sz="0" w:val="nil"/>
-          <w:right w:space="0" w:sz="0" w:val="nil"/>
-          <w:between w:space="0" w:sz="0" w:val="nil"/>
-        </w:pBdr>
-        <w:shd w:fill="auto" w:val="clear"/>
-        <w:spacing w:line="275.9999942779541" w:lineRule="auto"/>
-        <w:rPr>
-          <w:rFonts w:ascii="Google Sans" w:cs="Google Sans" w:eastAsia="Google Sans" w:hAnsi="Google Sans"/>
-          <w:color w:val="1f1f1f"/>
-        </w:rPr>
-      </w:pPr>
-      <w:r>
-        <w:rPr>
-          <w:rFonts w:ascii="Google Sans" w:cs="Google Sans" w:eastAsia="Google Sans" w:hAnsi="Google Sans"/>
-          <w:color w:val="1f1f1f"/>
-          <w:rtl w:val="0"/>
-        </w:rPr>
-        <w:t xml:space="preserve">To protect API token limits and compute resources, agents utilize semantic key normalization. They query historical SQLite registers before running expensive third-party integrations. If an interview module is required, the Mock Interviewer cross-references my tailored resume with trending technical stacks to generate custom architectural, coding, and system-design questions, outputting granular Markdown feedback scorecards.</w:t>
-      </w:r>
-    </w:p>
-    <w:p>
-      <w:pPr>
-        <w:pStyle w:val="Heading3"/>
-        <w:pBdr>
-          <w:top w:space="0" w:sz="0" w:val="nil"/>
-          <w:left w:space="0" w:sz="0" w:val="nil"/>
-          <w:bottom w:space="0" w:sz="0" w:val="nil"/>
-          <w:right w:space="0" w:sz="0" w:val="nil"/>
-          <w:between w:space="0" w:sz="0" w:val="nil"/>
-        </w:pBdr>
-        <w:shd w:fill="auto" w:val="clear"/>
-        <w:spacing w:before="0" w:line="275.9999942779541" w:lineRule="auto"/>
-        <w:rPr>
-          <w:rFonts w:ascii="Google Sans" w:cs="Google Sans" w:eastAsia="Google Sans" w:hAnsi="Google Sans"/>
-          <w:color w:val="1f1f1f"/>
-        </w:rPr>
-      </w:pPr>
-      <w:r>
-        <w:rPr>
-          <w:rFonts w:ascii="Google Sans" w:cs="Google Sans" w:eastAsia="Google Sans" w:hAnsi="Google Sans"/>
-          <w:color w:val="1f1f1f"/>
-          <w:rtl w:val="0"/>
-        </w:rPr>
-        <w:t xml:space="preserve">5. Portfolio Architect (Programmatic Proof-of-Work)</w:t>
-      </w:r>
-    </w:p>
-    <w:p>
-      <w:pPr>
-        <w:pBdr>
-          <w:top w:space="0" w:sz="0" w:val="nil"/>
-          <w:left w:space="0" w:sz="0" w:val="nil"/>
-          <w:bottom w:space="0" w:sz="0" w:val="nil"/>
-          <w:right w:space="0" w:sz="0" w:val="nil"/>
-          <w:between w:space="0" w:sz="0" w:val="nil"/>
-        </w:pBdr>
-        <w:shd w:fill="auto" w:val="clear"/>
-        <w:spacing w:line="275.9999942779541" w:lineRule="auto"/>
-        <w:rPr>
-          <w:rFonts w:ascii="Google Sans" w:cs="Google Sans" w:eastAsia="Google Sans" w:hAnsi="Google Sans"/>
-          <w:color w:val="1f1f1f"/>
-        </w:rPr>
-      </w:pPr>
-      <w:r>
-        <w:rPr>
-          <w:rFonts w:ascii="Google Sans" w:cs="Google Sans" w:eastAsia="Google Sans" w:hAnsi="Google Sans"/>
-          <w:color w:val="1f1f1f"/>
-          <w:rtl w:val="0"/>
-        </w:rPr>
-        <w:t xml:space="preserve">This is the ultimate loop closure: showing, not just telling. The agent takes leading tech stacks (e.g., </w:t>
-      </w:r>
-      <w:r>
-        <w:rPr>
-          <w:rFonts w:ascii="Google Sans" w:cs="Google Sans" w:eastAsia="Google Sans" w:hAnsi="Google Sans"/>
-          <w:i w:val="1"/>
-          <w:iCs w:val="1"/>
-          <w:color w:val="1f1f1f"/>
-          <w:rtl w:val="0"/>
-        </w:rPr>
-        <w:t xml:space="preserve">"LangGraph + SQLite Sync"</w:t>
-      </w:r>
-      <w:r>
-        <w:rPr>
-          <w:rFonts w:ascii="Google Sans" w:cs="Google Sans" w:eastAsia="Google Sans" w:hAnsi="Google Sans"/>
-          <w:color w:val="1f1f1f"/>
-          <w:rtl w:val="0"/>
-        </w:rPr>
-        <w:t xml:space="preserve">) and </w:t>
-      </w:r>
-      <w:r>
-        <w:rPr>
-          <w:rFonts w:ascii="Google Sans" w:cs="Google Sans" w:eastAsia="Google Sans" w:hAnsi="Google Sans"/>
-          <w:b w:val="1"/>
-          <w:bCs w:val="1"/>
-          <w:color w:val="1f1f1f"/>
-          <w:rtl w:val="0"/>
-        </w:rPr>
-        <w:t xml:space="preserve">automatically scaffolds fully functioning open-source project templates</w:t>
-      </w:r>
-      <w:r>
-        <w:rPr>
-          <w:rFonts w:ascii="Google Sans" w:cs="Google Sans" w:eastAsia="Google Sans" w:hAnsi="Google Sans"/>
-          <w:color w:val="1f1f1f"/>
-          <w:rtl w:val="0"/>
-        </w:rPr>
-        <w:t xml:space="preserve"> directly to my GitHub. It builds the directory hierarchies, writes source folders, unit tests, requirements lists, and injects complete YAML GitHub Actions CI pipelines, writing a premium architectural README to establish active proof-of-expertise.</w:t>
+        <w:t>This is the ultimate loop closure: showing, not just telling. The agent takes leading tech stacks (e.g., "LangGraph + SQLite Sync") and automatically scaffolds complete Test-Driven Development (TDD) upskilling workspaces directly to my GitHub. It deploys Pytest configuration files, stubs in src/main.py, and a suite of failing test specifications (tests/test_*.py) challenging the developer to complete the implementation to turn the tests green to establish active proof-of-expertise.</w:t>
       </w:r>
     </w:p>
     <w:p>
@@ -2934,7 +2777,7 @@
           <w:color w:val="1f1f1f"/>
           <w:rtl w:val="0"/>
         </w:rPr>
-        <w:t xml:space="preserve"> Hands-on experience managing OAuth2 token-refresh cycles, clean relational SQL database design, GitHub Actions environment injection, and strict XML document tree parsing.</w:t>
+        <w:t xml:space="preserve"> Hands-on experience managing stateless Git-as-a-Database branch synchronization, clean relational SQL database design, GitHub Actions environment injection, and strict XML document tree parsing.</w:t>
       </w:r>
     </w:p>
     <w:p>
@@ -2970,7 +2813,7 @@
           <w:color w:val="1f1f1f"/>
           <w:rtl w:val="0"/>
         </w:rPr>
-        <w:t xml:space="preserve"> The capacity to structure a resilient multi-stage pipeline (Ingestion ➔ Analysis ➔ Generation ➔ Delivery) equipped with structured error handling and failover mock layers.</w:t>
+        <w:t xml:space="preserve"> The capacity to structure a resilient multi-stage pipeline (Ingestion ➔ Analysis ➔ Generation ➔ Delivery) equipped with Git branch persistence layers and structured LLMOps execution tracing.</w:t>
       </w:r>
     </w:p>
     <w:p>
@@ -3179,7 +3022,7 @@
           <w:color w:val="1f1f1f"/>
           <w:rtl w:val="0"/>
         </w:rPr>
-        <w:t xml:space="preserve">The system is live, the repositories are actively scaffolding, and the data is adapting dynamically every single week.</w:t>
+        <w:t>The system is live, the repositories are actively scaffolding, the step summary observabilities are logging automatically, the step summary observabilities are logging automatically, and the data is adapting dynamically every single week.</w:t>
       </w:r>
     </w:p>
     <w:p>

</xml_diff>